<commit_message>
CL3 scenario: retire the Improvement Business Case (-> Solution Design)
The Ledgerline-improvement design dropped the business case (cost-benefit rides in the Solution Design; approval = the design presentation), but the in-world scenario still framed an 'Improvement Business Case' as the Phase-1 deliverable/gate. Re-pointed across all 5 ledgerline-improvement docs (MSA deliverables/phases/fees, role-brief, consultation-notes, improvement-requirements/IR-6, indian-regulatory-requirements) to the Solution Design + its approval presentation. Regenerated YAT-Team-Plan-Template.docx to the component model. CL1's and the LMS's business cases are legitimate and untouched.

Co-Authored-By: Claude Opus 4.8 (1M context) <noreply@anthropic.com>
</commit_message>
<xml_diff>
--- a/public/templates/YAT-Team-Plan-Template.docx
+++ b/public/templates/YAT-Team-Plan-Template.docx
@@ -241,7 +241,7 @@
                 <w:color w:val="6B6660"/>
                 <w:sz w:val="20"/>
               </w:rPr>
-              <w:t>[ Your team — list each member and the dimension they own ]</w:t>
+              <w:t>[ Your team — list each member and the cloud component they own ]</w:t>
             </w:r>
           </w:p>
         </w:tc>
@@ -436,6 +436,9 @@
       </w:r>
     </w:p>
     <w:p>
+      <w:pPr>
+        <w:spacing w:after="120"/>
+      </w:pPr>
       <w:r>
         <w:rPr>
           <w:i/>
@@ -459,17 +462,20 @@
         <w:pStyle w:val="Heading1"/>
       </w:pPr>
       <w:r>
-        <w:t>2. Team structure and dimension ownership</w:t>
+        <w:t>2. Team structure and component ownership</w:t>
       </w:r>
     </w:p>
     <w:p>
+      <w:pPr>
+        <w:spacing w:after="120"/>
+      </w:pPr>
       <w:r>
         <w:rPr>
           <w:i/>
           <w:color w:val="6B6660"/>
           <w:sz w:val="19"/>
         </w:rPr>
-        <w:t>List your team members and the improvement dimension each owns (security, reliability, scalability, cost) so the team covers all four. Note who is leading this phase — the lead role rotates. Add rows as needed.</w:t>
+        <w:t>List your team members and the cloud component each owns (network, compute, database, storage) so the team covers the whole system, one component each. Note who is leading this phase — the lead role rotates. Add rows as needed.</w:t>
       </w:r>
     </w:p>
     <w:tbl>
@@ -525,7 +531,7 @@
                 <w:color w:val="FFFFFF"/>
                 <w:sz w:val="19"/>
               </w:rPr>
-              <w:t>Dimension owned</w:t>
+              <w:t>Component owned</w:t>
             </w:r>
           </w:p>
         </w:tc>
@@ -547,7 +553,7 @@
                 <w:color w:val="FFFFFF"/>
                 <w:sz w:val="19"/>
               </w:rPr>
-              <w:t>Focus of the dimension</w:t>
+              <w:t>Scope of the component</w:t>
             </w:r>
           </w:p>
         </w:tc>
@@ -591,7 +597,7 @@
                 <w:color w:val="6B6660"/>
                 <w:sz w:val="19"/>
               </w:rPr>
-              <w:t>[ Security / Reliability / Scalability / Cost ]</w:t>
+              <w:t>[ Network / Compute / Database / Storage ]</w:t>
             </w:r>
           </w:p>
         </w:tc>
@@ -656,7 +662,7 @@
                 <w:color w:val="6B6660"/>
                 <w:sz w:val="19"/>
               </w:rPr>
-              <w:t>[ Security / Reliability / Scalability / Cost ]</w:t>
+              <w:t>[ Network / Compute / Database / Storage ]</w:t>
             </w:r>
           </w:p>
         </w:tc>
@@ -721,7 +727,7 @@
                 <w:color w:val="6B6660"/>
                 <w:sz w:val="19"/>
               </w:rPr>
-              <w:t>[ Security / Reliability / Scalability / Cost ]</w:t>
+              <w:t>[ Network / Compute / Database / Storage ]</w:t>
             </w:r>
           </w:p>
         </w:tc>
@@ -786,7 +792,7 @@
                 <w:color w:val="6B6660"/>
                 <w:sz w:val="19"/>
               </w:rPr>
-              <w:t>[ Security / Reliability / Scalability / Cost ]</w:t>
+              <w:t>[ Network / Compute / Database / Storage ]</w:t>
             </w:r>
           </w:p>
         </w:tc>
@@ -823,6 +829,9 @@
       </w:r>
     </w:p>
     <w:p>
+      <w:pPr>
+        <w:spacing w:after="120"/>
+      </w:pPr>
       <w:r>
         <w:rPr>
           <w:i/>
@@ -864,7 +873,7 @@
                 <w:color w:val="FFFFFF"/>
                 <w:sz w:val="19"/>
               </w:rPr>
-              <w:t>Member (dimension)</w:t>
+              <w:t>Member (component)</w:t>
             </w:r>
           </w:p>
         </w:tc>
@@ -1290,13 +1299,16 @@
       </w:r>
     </w:p>
     <w:p>
+      <w:pPr>
+        <w:spacing w:after="120"/>
+      </w:pPr>
       <w:r>
         <w:rPr>
           <w:i/>
           <w:color w:val="6B6660"/>
           <w:sz w:val="19"/>
         </w:rPr>
-        <w:t>How will you make sure each member is accountable for their role and responsibilities? Consider owned-dimension deliverables, the sign-off gates, the led-meeting record, peer review at integration, and the escalation path.</w:t>
+        <w:t>How will you make sure each member is accountable for their role and responsibilities? Consider owned-component deliverables, the team sign-off gate, the led-meeting record, peer review at integration, and the escalation path.</w:t>
       </w:r>
     </w:p>
     <w:p>
@@ -1317,13 +1329,16 @@
       </w:r>
     </w:p>
     <w:p>
+      <w:pPr>
+        <w:spacing w:after="120"/>
+      </w:pPr>
       <w:r>
         <w:rPr>
           <w:i/>
           <w:color w:val="6B6660"/>
           <w:sz w:val="19"/>
         </w:rPr>
-        <w:t>Allocate the improvement work across the team, by dimension, with the instruction each member needs and an allowance for your contingencies (§6). Each member carries their dimension across analysis (AT1), design (AT2) and implementation (AT3).</w:t>
+        <w:t>Allocate the infrastructure-as-code one component per member, with the instruction each member needs and an allowance for your contingencies (§6). Each member writes their component to the approved design and integrates it into the team's single deployable template.</w:t>
       </w:r>
     </w:p>
     <w:tbl>
@@ -1379,7 +1394,7 @@
                 <w:color w:val="FFFFFF"/>
                 <w:sz w:val="19"/>
               </w:rPr>
-              <w:t>Allocated tasks (AT1 → AT2 → AT3)</w:t>
+              <w:t>Component allocated (CloudFormation to write)</w:t>
             </w:r>
           </w:p>
         </w:tc>
@@ -1445,7 +1460,7 @@
                 <w:color w:val="6B6660"/>
                 <w:sz w:val="19"/>
               </w:rPr>
-              <w:t>[ … ]</w:t>
+              <w:t>[ Network / Compute / Database / Storage ]</w:t>
             </w:r>
           </w:p>
         </w:tc>
@@ -1510,7 +1525,7 @@
                 <w:color w:val="6B6660"/>
                 <w:sz w:val="19"/>
               </w:rPr>
-              <w:t>[ … ]</w:t>
+              <w:t>[ Network / Compute / Database / Storage ]</w:t>
             </w:r>
           </w:p>
         </w:tc>
@@ -1575,7 +1590,7 @@
                 <w:color w:val="6B6660"/>
                 <w:sz w:val="19"/>
               </w:rPr>
-              <w:t>[ … ]</w:t>
+              <w:t>[ Network / Compute / Database / Storage ]</w:t>
             </w:r>
           </w:p>
         </w:tc>
@@ -1640,7 +1655,7 @@
                 <w:color w:val="6B6660"/>
                 <w:sz w:val="19"/>
               </w:rPr>
-              <w:t>[ … ]</w:t>
+              <w:t>[ Network / Compute / Database / Storage ]</w:t>
             </w:r>
           </w:p>
         </w:tc>
@@ -1677,6 +1692,9 @@
       </w:r>
     </w:p>
     <w:p>
+      <w:pPr>
+        <w:spacing w:after="120"/>
+      </w:pPr>
       <w:r>
         <w:rPr>
           <w:i/>
@@ -2037,6 +2055,9 @@
       </w:r>
     </w:p>
     <w:p>
+      <w:pPr>
+        <w:spacing w:after="120"/>
+      </w:pPr>
       <w:r>
         <w:rPr>
           <w:i/>
@@ -2076,6 +2097,9 @@
       </w:r>
     </w:p>
     <w:p>
+      <w:pPr>
+        <w:spacing w:after="120"/>
+      </w:pPr>
       <w:r>
         <w:rPr>
           <w:i/>

</xml_diff>